<commit_message>
Docs: regenerer godkendelsespakke + valideringsrapport
</commit_message>
<xml_diff>
--- a/docs/VAT-Analytics_Hosting_og_drift.docx
+++ b/docs/VAT-Analytics_Hosting_og_drift.docx
@@ -843,6 +843,246 @@
                 <w:bCs w:val="false"/>
               </w:rPr>
               <w:t xml:space="preserve">2048</w:t>
+            </w:r>
+          </w:p>
+        </w:tc>
+      </w:tr>
+      <w:tr>
+        <w:tc>
+          <w:tcPr>
+            <w:tcW w:type="dxa" w:w="2500"/>
+            <w:tcBorders>
+              <w:top w:val="single" w:color="CCCCCC" w:sz="1"/>
+              <w:left w:val="single" w:color="CCCCCC" w:sz="1"/>
+              <w:bottom w:val="single" w:color="CCCCCC" w:sz="1"/>
+              <w:right w:val="single" w:color="CCCCCC" w:sz="1"/>
+            </w:tcBorders>
+            <w:tcMar>
+              <w:top w:type="dxa" w:w="80"/>
+              <w:left w:type="dxa" w:w="120"/>
+              <w:bottom w:type="dxa" w:w="80"/>
+              <w:right w:type="dxa" w:w="120"/>
+            </w:tcMar>
+          </w:tcPr>
+          <w:p>
+            <w:r>
+              <w:rPr>
+                <w:b w:val="false"/>
+                <w:bCs w:val="false"/>
+              </w:rPr>
+              <w:t xml:space="preserve">JOB_RETENTION_SECONDS</w:t>
+            </w:r>
+          </w:p>
+        </w:tc>
+        <w:tc>
+          <w:tcPr>
+            <w:tcW w:type="dxa" w:w="4660"/>
+            <w:tcBorders>
+              <w:top w:val="single" w:color="CCCCCC" w:sz="1"/>
+              <w:left w:val="single" w:color="CCCCCC" w:sz="1"/>
+              <w:bottom w:val="single" w:color="CCCCCC" w:sz="1"/>
+              <w:right w:val="single" w:color="CCCCCC" w:sz="1"/>
+            </w:tcBorders>
+            <w:tcMar>
+              <w:top w:type="dxa" w:w="80"/>
+              <w:left w:type="dxa" w:w="120"/>
+              <w:bottom w:type="dxa" w:w="80"/>
+              <w:right w:type="dxa" w:w="120"/>
+            </w:tcMar>
+          </w:tcPr>
+          <w:p>
+            <w:r>
+              <w:rPr>
+                <w:b w:val="false"/>
+                <w:bCs w:val="false"/>
+              </w:rPr>
+              <w:t xml:space="preserve">TTL for færdige/fejlede async-jobs i hukommelsen.</w:t>
+            </w:r>
+          </w:p>
+        </w:tc>
+        <w:tc>
+          <w:tcPr>
+            <w:tcW w:type="dxa" w:w="2200"/>
+            <w:tcBorders>
+              <w:top w:val="single" w:color="CCCCCC" w:sz="1"/>
+              <w:left w:val="single" w:color="CCCCCC" w:sz="1"/>
+              <w:bottom w:val="single" w:color="CCCCCC" w:sz="1"/>
+              <w:right w:val="single" w:color="CCCCCC" w:sz="1"/>
+            </w:tcBorders>
+            <w:tcMar>
+              <w:top w:type="dxa" w:w="80"/>
+              <w:left w:type="dxa" w:w="120"/>
+              <w:bottom w:type="dxa" w:w="80"/>
+              <w:right w:type="dxa" w:w="120"/>
+            </w:tcMar>
+          </w:tcPr>
+          <w:p>
+            <w:r>
+              <w:rPr>
+                <w:b w:val="false"/>
+                <w:bCs w:val="false"/>
+              </w:rPr>
+              <w:t xml:space="preserve">3600</w:t>
+            </w:r>
+          </w:p>
+        </w:tc>
+      </w:tr>
+      <w:tr>
+        <w:tc>
+          <w:tcPr>
+            <w:tcW w:type="dxa" w:w="2500"/>
+            <w:tcBorders>
+              <w:top w:val="single" w:color="CCCCCC" w:sz="1"/>
+              <w:left w:val="single" w:color="CCCCCC" w:sz="1"/>
+              <w:bottom w:val="single" w:color="CCCCCC" w:sz="1"/>
+              <w:right w:val="single" w:color="CCCCCC" w:sz="1"/>
+            </w:tcBorders>
+            <w:tcMar>
+              <w:top w:type="dxa" w:w="80"/>
+              <w:left w:type="dxa" w:w="120"/>
+              <w:bottom w:type="dxa" w:w="80"/>
+              <w:right w:type="dxa" w:w="120"/>
+            </w:tcMar>
+          </w:tcPr>
+          <w:p>
+            <w:r>
+              <w:rPr>
+                <w:b w:val="false"/>
+                <w:bCs w:val="false"/>
+              </w:rPr>
+              <w:t xml:space="preserve">MAX_JOBS</w:t>
+            </w:r>
+          </w:p>
+        </w:tc>
+        <w:tc>
+          <w:tcPr>
+            <w:tcW w:type="dxa" w:w="4660"/>
+            <w:tcBorders>
+              <w:top w:val="single" w:color="CCCCCC" w:sz="1"/>
+              <w:left w:val="single" w:color="CCCCCC" w:sz="1"/>
+              <w:bottom w:val="single" w:color="CCCCCC" w:sz="1"/>
+              <w:right w:val="single" w:color="CCCCCC" w:sz="1"/>
+            </w:tcBorders>
+            <w:tcMar>
+              <w:top w:type="dxa" w:w="80"/>
+              <w:left w:type="dxa" w:w="120"/>
+              <w:bottom w:type="dxa" w:w="80"/>
+              <w:right w:type="dxa" w:w="120"/>
+            </w:tcMar>
+          </w:tcPr>
+          <w:p>
+            <w:r>
+              <w:rPr>
+                <w:b w:val="false"/>
+                <w:bCs w:val="false"/>
+              </w:rPr>
+              <w:t xml:space="preserve">Maks. antal async-jobs i hukommelsen (ældste evictes).</w:t>
+            </w:r>
+          </w:p>
+        </w:tc>
+        <w:tc>
+          <w:tcPr>
+            <w:tcW w:type="dxa" w:w="2200"/>
+            <w:tcBorders>
+              <w:top w:val="single" w:color="CCCCCC" w:sz="1"/>
+              <w:left w:val="single" w:color="CCCCCC" w:sz="1"/>
+              <w:bottom w:val="single" w:color="CCCCCC" w:sz="1"/>
+              <w:right w:val="single" w:color="CCCCCC" w:sz="1"/>
+            </w:tcBorders>
+            <w:tcMar>
+              <w:top w:type="dxa" w:w="80"/>
+              <w:left w:type="dxa" w:w="120"/>
+              <w:bottom w:type="dxa" w:w="80"/>
+              <w:right w:type="dxa" w:w="120"/>
+            </w:tcMar>
+          </w:tcPr>
+          <w:p>
+            <w:r>
+              <w:rPr>
+                <w:b w:val="false"/>
+                <w:bCs w:val="false"/>
+              </w:rPr>
+              <w:t xml:space="preserve">100</w:t>
+            </w:r>
+          </w:p>
+        </w:tc>
+      </w:tr>
+      <w:tr>
+        <w:tc>
+          <w:tcPr>
+            <w:tcW w:type="dxa" w:w="2500"/>
+            <w:tcBorders>
+              <w:top w:val="single" w:color="CCCCCC" w:sz="1"/>
+              <w:left w:val="single" w:color="CCCCCC" w:sz="1"/>
+              <w:bottom w:val="single" w:color="CCCCCC" w:sz="1"/>
+              <w:right w:val="single" w:color="CCCCCC" w:sz="1"/>
+            </w:tcBorders>
+            <w:tcMar>
+              <w:top w:type="dxa" w:w="80"/>
+              <w:left w:type="dxa" w:w="120"/>
+              <w:bottom w:type="dxa" w:w="80"/>
+              <w:right w:type="dxa" w:w="120"/>
+            </w:tcMar>
+          </w:tcPr>
+          <w:p>
+            <w:r>
+              <w:rPr>
+                <w:b w:val="false"/>
+                <w:bCs w:val="false"/>
+              </w:rPr>
+              <w:t xml:space="preserve">MATERIALITY_* (valgfri)</w:t>
+            </w:r>
+          </w:p>
+        </w:tc>
+        <w:tc>
+          <w:tcPr>
+            <w:tcW w:type="dxa" w:w="4660"/>
+            <w:tcBorders>
+              <w:top w:val="single" w:color="CCCCCC" w:sz="1"/>
+              <w:left w:val="single" w:color="CCCCCC" w:sz="1"/>
+              <w:bottom w:val="single" w:color="CCCCCC" w:sz="1"/>
+              <w:right w:val="single" w:color="CCCCCC" w:sz="1"/>
+            </w:tcBorders>
+            <w:tcMar>
+              <w:top w:type="dxa" w:w="80"/>
+              <w:left w:type="dxa" w:w="120"/>
+              <w:bottom w:type="dxa" w:w="80"/>
+              <w:right w:type="dxa" w:w="120"/>
+            </w:tcMar>
+          </w:tcPr>
+          <w:p>
+            <w:r>
+              <w:rPr>
+                <w:b w:val="false"/>
+                <w:bCs w:val="false"/>
+              </w:rPr>
+              <w:t xml:space="preserve">Engagement-kalibrerbare tærskler + severity-vægte (se analytics/materiality.py).</w:t>
+            </w:r>
+          </w:p>
+        </w:tc>
+        <w:tc>
+          <w:tcPr>
+            <w:tcW w:type="dxa" w:w="2200"/>
+            <w:tcBorders>
+              <w:top w:val="single" w:color="CCCCCC" w:sz="1"/>
+              <w:left w:val="single" w:color="CCCCCC" w:sz="1"/>
+              <w:bottom w:val="single" w:color="CCCCCC" w:sz="1"/>
+              <w:right w:val="single" w:color="CCCCCC" w:sz="1"/>
+            </w:tcBorders>
+            <w:tcMar>
+              <w:top w:type="dxa" w:w="80"/>
+              <w:left w:type="dxa" w:w="120"/>
+              <w:bottom w:type="dxa" w:w="80"/>
+              <w:right w:type="dxa" w:w="120"/>
+            </w:tcMar>
+          </w:tcPr>
+          <w:p>
+            <w:r>
+              <w:rPr>
+                <w:b w:val="false"/>
+                <w:bCs w:val="false"/>
+              </w:rPr>
+              <w:t xml:space="preserve">(hidtidig adfærd)</w:t>
             </w:r>
           </w:p>
         </w:tc>

</xml_diff>